<commit_message>
feat(blog): ship final editorial hero as og:image + in-body image (same file)
- public/og/asa-every-signal-was-green-1200x630.jpg: final hero (exact
  1200x630, 62KB progressive JPG) — climb to '$140 · ALL SIGNALS GREEN',
  nosedive through the four 'a fresh reason to hold' floors, orange ejection
  seat at -55-60, dim continuation to -70, footer hook
- build-blog.mjs: og:image + first in-body image point at the same file;
  og:image:type derived from extension; alt text updated
- retire the SVG-generated og.png/hero.svg (make-blog-hero.py stays as a
  documented fallback generator)
- pack: hero ATTACH line + image-prompt appendix updated; docx regenerated

Co-Authored-By: Claude Fable 5 <noreply@anthropic.com>
</commit_message>
<xml_diff>
--- a/docs/social/2026-08-06_every-signal-was-green_pack.docx
+++ b/docs/social/2026-08-06_every-signal-was-green_pack.docx
@@ -72,7 +72,7 @@
         <w:t>Hero image (ATTACH THIS FILE):</w:t>
       </w:r>
       <w:r>
-        <w:t xml:space="preserve"> /mnt/c/src/ai-stock-assist-web/public/blog/every-signal-was-green/og.png — flat-vector editorial infographic, 1200×630 (nosedive path, floors at −20/−30/−40/−50, ejection seat at −55–60, −70 floor). Live at https://www.aistockassist.com/blog/every-signal-was-green/og.png (also the essay's og:image). Attach this file to LinkedIn posts; X/Bluesky/Substack render it automatically from the link card.</w:t>
+        <w:t xml:space="preserve"> /mnt/c/src/ai-stock-assist-web/public/og/asa-every-signal-was-green-1200x630.jpg — editorial infographic, 1200×630, 62KB (climb to "$140 · ALL SIGNALS GREEN", nosedive through floors −20/−30/−40/−50 each marked "a fresh reason to hold", orange ejection seat at −55–60, dim continuation to −70, footer hook). Live at https://www.aistockassist.com/og/asa-every-signal-was-green-1200x630.jpg — the SAME file is the essay's og:image and its first in-body image, so link cards match the page. Attach this file to LinkedIn posts; X/Bluesky/Substack render it automatically from the link card.</w:t>
       </w:r>
     </w:p>
     <w:p>
@@ -887,7 +887,7 @@
           <w:color w:val="64748B"/>
           <w:sz w:val="20"/>
         </w:rPr>
-        <w:t>For regenerating or re-theming the hero. Generate at 1200×630, save as public/blog/every-signal-was-green/og.png. ASA brand palette: near-black navy ground (#0a0e1a), cyan accent (#22d3ee), red dive (#ef4444), green signals (#22c55e), slate text (#94a3b8). The committed generator is scripts/make-blog-hero.py (pure SVG — prefer re-running it over prompting an image model).</w:t>
+        <w:t>The prompt that produced the shipped hero (public/og/asa-every-signal-was-green-1200x630.jpg). For regenerating or re-theming: generate, resize/crop to exactly 1200×630, export JPG under ~300KB, save to that path — it is both the og:image and the first in-body image. A pure-SVG fallback generator also exists at scripts/make-blog-hero.py.</w:t>
       </w:r>
     </w:p>
     <w:p>
@@ -903,7 +903,7 @@
     </w:p>
     <w:p>
       <w:r>
-        <w:t>A flat-vector editorial infographic on a near-black navy background (#0a0e1a) with a subtle technical grid. A small slate paper-plane glyph at the upper left tips into a red (#ef4444) nosedive path that falls left-to-right across the frame, bouncing slightly at each of four dashed horizontal floor lines labeled −20%, −30%, −40%, −50% in monospace type. At the −55–60% zone, a cyan (#22d3ee) circular marker holds a flat ejection-seat glyph with an upward eject arrow, labeled "EJECT: −55–60%". The path continues as a dashed red line to a dotted red floor labeled −70%, pulling up slightly just before the right edge. A row of five green (#22c55e) signal dots at the top reads "SIGNALS: ALL GREEN" in monospace. Footer band in dark navy with centered monospace caption: "MY 50% CUSHION MET A 70% FLOOR". Clean editorial infographic style, high contrast, no photorealism, no stock-photo look, no candlesticks, no logos, no faces, no prices. Aspect ratio 1200×630.</w:t>
+        <w:t>A flat-vector editorial infographic on a near-black background with a subtle technical grid, drawn in thin monospace-terminal style. A white price line climbs steeply from the lower left to a peak marked with a small open circle and the monospace label "$140 · ALL SIGNALS GREEN", then nosedives down and to the right for the rest of the frame in a jagged two-year descent. Four faint dashed horizontal floor lines at −20%, −30%, −40% and −50%, each labeled in grey monospace on the right with a small tick and the words "a fresh reason to hold". Where the falling line crosses the −55–60% zone, a bright orange-red flat ejection-seat glyph punches out of the line with a dashed upward-arrow trajectory, labeled "EJECT · −55−60%" in the same orange. Past the ejection point the price line continues dimmer and greyer down to a final label "−70%". Full-width footer band separated by a thin orange rule, with the centered orange monospace caption: "MY 50% CUSHION MET A 70% FLOOR." Clean editorial infographic style, high contrast, no photorealism, no stock-photo look, no candlesticks, no logos, no faces. Aspect ratio 1200×630.</w:t>
       </w:r>
     </w:p>
     <w:p>

</xml_diff>

<commit_message>
pack builder: embed the hero image in the .docx below the ATTACH line
Co-Authored-By: Claude Fable 5 <noreply@anthropic.com>
</commit_message>
<xml_diff>
--- a/docs/social/2026-08-06_every-signal-was-green_pack.docx
+++ b/docs/social/2026-08-06_every-signal-was-green_pack.docx
@@ -73,6 +73,52 @@
       </w:r>
       <w:r>
         <w:t xml:space="preserve"> /mnt/c/src/ai-stock-assist-web/public/og/asa-every-signal-was-green-1200x630.jpg — editorial infographic, 1200×630, 62KB (climb to "$140 · ALL SIGNALS GREEN", nosedive through floors −20/−30/−40/−50 each marked "a fresh reason to hold", orange ejection seat at −55–60, dim continuation to −70, footer hook). Live at https://www.aistockassist.com/og/asa-every-signal-was-green-1200x630.jpg — the SAME file is the essay's og:image and its first in-body image, so link cards match the page. Attach this file to LinkedIn posts; X/Bluesky/Substack render it automatically from the link card.</w:t>
+      </w:r>
+    </w:p>
+    <w:p>
+      <w:r>
+        <w:drawing>
+          <wp:inline xmlns:a="http://schemas.openxmlformats.org/drawingml/2006/main" xmlns:pic="http://schemas.openxmlformats.org/drawingml/2006/picture">
+            <wp:extent cx="5486400" cy="2880360"/>
+            <wp:docPr id="1" name="Picture 1"/>
+            <wp:cNvGraphicFramePr>
+              <a:graphicFrameLocks noChangeAspect="1"/>
+            </wp:cNvGraphicFramePr>
+            <a:graphic>
+              <a:graphicData uri="http://schemas.openxmlformats.org/drawingml/2006/picture">
+                <pic:pic>
+                  <pic:nvPicPr>
+                    <pic:cNvPr id="0" name="asa-every-signal-was-green-1200x630.jpg"/>
+                    <pic:cNvPicPr/>
+                  </pic:nvPicPr>
+                  <pic:blipFill>
+                    <a:blip r:embed="rId9"/>
+                    <a:stretch>
+                      <a:fillRect/>
+                    </a:stretch>
+                  </pic:blipFill>
+                  <pic:spPr>
+                    <a:xfrm>
+                      <a:off x="0" y="0"/>
+                      <a:ext cx="5486400" cy="2880360"/>
+                    </a:xfrm>
+                    <a:prstGeom prst="rect"/>
+                  </pic:spPr>
+                </pic:pic>
+              </a:graphicData>
+            </a:graphic>
+          </wp:inline>
+        </w:drawing>
+      </w:r>
+    </w:p>
+    <w:p>
+      <w:r>
+        <w:rPr>
+          <w:i/>
+          <w:color w:val="64748B"/>
+          <w:sz w:val="18"/>
+        </w:rPr>
+        <w:t>^ THE HERO — right-click → Save as Picture (or drag out) to attach on LinkedIn. Also in Downloads as asa-every-signal-was-green-1200x630.jpg.</w:t>
       </w:r>
     </w:p>
     <w:p>

</xml_diff>